<commit_message>
Release 0.5.0: qang.formulation (15 gates, 14 algorithms in qg language) and the starter Colab notebook
</commit_message>
<xml_diff>
--- a/manuscript/qang_teoria_es.docx
+++ b/manuscript/qang_teoria_es.docx
@@ -1149,7 +1149,7 @@
         <w:t xml:space="preserve"> </w:t>
       </w:r>
       <w:r>
-        <w:t xml:space="preserve">21</w:t>
+        <w:t xml:space="preserve">los</w:t>
       </w:r>
       <w:r>
         <w:t xml:space="preserve"> </w:t>
@@ -10688,13 +10688,13 @@
       </w:r>
     </w:p>
     <w:bookmarkEnd w:id="26"/>
-    <w:bookmarkStart w:id="28" w:name="verificación"/>
+    <w:bookmarkStart w:id="28" w:name="verificación-y-uso"/>
     <w:p>
       <w:pPr>
         <w:pStyle w:val="Heading1"/>
       </w:pPr>
       <w:r>
-        <w:t xml:space="preserve">Verificación</w:t>
+        <w:t xml:space="preserve">Verificación y uso</w:t>
       </w:r>
     </w:p>
     <w:p>
@@ -10702,16 +10702,64 @@
         <w:pStyle w:val="FirstParagraph"/>
       </w:pPr>
       <w:r>
+        <w:t xml:space="preserve">La formulación está en la librería como el módulo</w:t>
+      </w:r>
+      <w:r>
+        <w:t xml:space="preserve"> </w:t>
+      </w:r>
+      <w:r>
         <w:rPr>
           <w:rStyle w:val="VerbatimChar"/>
         </w:rPr>
-        <w:t xml:space="preserve">examples/qg_formulation_checks.py</w:t>
-      </w:r>
-      <w:r>
-        <w:t xml:space="preserve"> </w:t>
-      </w:r>
-      <w:r>
-        <w:t xml:space="preserve">calcula</w:t>
+        <w:t xml:space="preserve">qang.formulation</w:t>
+      </w:r>
+      <w:r>
+        <w:t xml:space="preserve"> </w:t>
+      </w:r>
+      <w:r>
+        <w:t xml:space="preserve">(desde la versión 0.5.0,</w:t>
+      </w:r>
+      <w:r>
+        <w:t xml:space="preserve"> </w:t>
+      </w:r>
+      <w:r>
+        <w:rPr>
+          <w:rStyle w:val="VerbatimChar"/>
+        </w:rPr>
+        <w:t xml:space="preserve">pip install qang</w:t>
+      </w:r>
+      <w:r>
+        <w:t xml:space="preserve">):</w:t>
+      </w:r>
+      <w:r>
+        <w:t xml:space="preserve"> </w:t>
+      </w:r>
+      <w:r>
+        <w:rPr>
+          <w:rStyle w:val="VerbatimChar"/>
+        </w:rPr>
+        <w:t xml:space="preserve">conjugate</w:t>
+      </w:r>
+      <w:r>
+        <w:t xml:space="preserve"> </w:t>
+      </w:r>
+      <w:r>
+        <w:t xml:space="preserve">y</w:t>
+      </w:r>
+      <w:r>
+        <w:t xml:space="preserve"> </w:t>
+      </w:r>
+      <w:r>
+        <w:rPr>
+          <w:rStyle w:val="VerbatimChar"/>
+        </w:rPr>
+        <w:t xml:space="preserve">gate_table</w:t>
+      </w:r>
+      <w:r>
+        <w:t xml:space="preserve"> </w:t>
+      </w:r>
+      <w:r>
+        <w:t xml:space="preserve">dan</w:t>
       </w:r>
       <w:r>
         <w:t xml:space="preserve"> </w:t>
@@ -10743,13 +10791,13 @@
         <w:t xml:space="preserve"> </w:t>
       </w:r>
       <w:r>
-        <w:t xml:space="preserve">para las quince compuertas y cada</w:t>
-      </w:r>
-      <w:r>
-        <w:t xml:space="preserve"> </w:t>
-      </w:r>
-      <w:r>
-        <w:t xml:space="preserve">identidad de lectura con vectores de estado exactos;</w:t>
+        <w:t xml:space="preserve">para las quince</w:t>
+      </w:r>
+      <w:r>
+        <w:t xml:space="preserve"> </w:t>
+      </w:r>
+      <w:r>
+        <w:t xml:space="preserve">compuertas,</w:t>
       </w:r>
       <w:r>
         <w:t xml:space="preserve"> </w:t>
@@ -10758,13 +10806,49 @@
         <w:rPr>
           <w:rStyle w:val="VerbatimChar"/>
         </w:rPr>
-        <w:t xml:space="preserve">tests/test_qg_formulation_checks.py</w:t>
-      </w:r>
-      <w:r>
-        <w:t xml:space="preserve"> </w:t>
-      </w:r>
-      <w:r>
-        <w:t xml:space="preserve">fija las 21 comprobaciones (en</w:t>
+        <w:t xml:space="preserve">qg_values</w:t>
+      </w:r>
+      <w:r>
+        <w:t xml:space="preserve"> </w:t>
+      </w:r>
+      <w:r>
+        <w:t xml:space="preserve">y</w:t>
+      </w:r>
+      <w:r>
+        <w:t xml:space="preserve"> </w:t>
+      </w:r>
+      <w:r>
+        <w:rPr>
+          <w:rStyle w:val="VerbatimChar"/>
+        </w:rPr>
+        <w:t xml:space="preserve">apply_gate</w:t>
+      </w:r>
+      <w:r>
+        <w:t xml:space="preserve"> </w:t>
+      </w:r>
+      <w:r>
+        <w:t xml:space="preserve">trabajan directamente con valores qg, y cada</w:t>
+      </w:r>
+      <w:r>
+        <w:t xml:space="preserve"> </w:t>
+      </w:r>
+      <w:r>
+        <w:t xml:space="preserve">identidad de lectura tiene su función.</w:t>
+      </w:r>
+      <w:r>
+        <w:t xml:space="preserve"> </w:t>
+      </w:r>
+      <w:r>
+        <w:rPr>
+          <w:rStyle w:val="VerbatimChar"/>
+        </w:rPr>
+        <w:t xml:space="preserve">tests/test_formulation.py</w:t>
+      </w:r>
+      <w:r>
+        <w:t xml:space="preserve"> </w:t>
+      </w:r>
+      <w:r>
+        <w:t xml:space="preserve">fija las comprobaciones (en</w:t>
       </w:r>
       <w:r>
         <w:t xml:space="preserve"> </w:t>
@@ -10778,13 +10862,51 @@
         </w:r>
       </w:hyperlink>
       <w:r>
-        <w:t xml:space="preserve">). La única afirmación no verificada</w:t>
-      </w:r>
-      <w:r>
-        <w:t xml:space="preserve"> </w:t>
-      </w:r>
-      <w:r>
-        <w:t xml:space="preserve">numéricamente es la de HHL, que es la lectura estándar del algoritmo.</w:t>
+        <w:t xml:space="preserve">), y el cuaderno</w:t>
+      </w:r>
+      <w:r>
+        <w:t xml:space="preserve"> </w:t>
+      </w:r>
+      <w:r>
+        <w:rPr>
+          <w:rStyle w:val="VerbatimChar"/>
+        </w:rPr>
+        <w:t xml:space="preserve">notebooks/qang_inicio_formulacion.ipynb</w:t>
+      </w:r>
+      <w:r>
+        <w:t xml:space="preserve"> </w:t>
+      </w:r>
+      <w:r>
+        <w:t xml:space="preserve">las recorre en Colab. La lectura de HHL se comprueba para una matriz de</w:t>
+      </w:r>
+      <w:r>
+        <w:t xml:space="preserve"> </w:t>
+      </w:r>
+      <m:oMath>
+        <m:r>
+          <m:t>2</m:t>
+        </m:r>
+        <m:r>
+          <m:rPr>
+            <m:sty m:val="p"/>
+          </m:rPr>
+          <m:t>×</m:t>
+        </m:r>
+        <m:r>
+          <m:t>2</m:t>
+        </m:r>
+      </m:oMath>
+      <w:r>
+        <w:t xml:space="preserve"> </w:t>
+      </w:r>
+      <w:r>
+        <w:t xml:space="preserve">con álgebra lineal exacta,</w:t>
+      </w:r>
+      <w:r>
+        <w:t xml:space="preserve"> </w:t>
+      </w:r>
+      <w:r>
+        <w:t xml:space="preserve">no con un circuito.</w:t>
       </w:r>
     </w:p>
     <w:bookmarkEnd w:id="28"/>

</xml_diff>

<commit_message>
Article (English): quantum gates and algorithms in qg units; PDF and Word; algorithm references
</commit_message>
<xml_diff>
--- a/manuscript/qang_teoria_es.docx
+++ b/manuscript/qang_teoria_es.docx
@@ -8821,19 +8821,42 @@
         <w:t xml:space="preserve"> </w:t>
       </w:r>
       <w:r>
-        <w:t xml:space="preserve">Esto no se verificó numéricamente acá; es la</w:t>
-      </w:r>
-      <w:r>
-        <w:t xml:space="preserve"> </w:t>
-      </w:r>
-      <w:r>
-        <w:t xml:space="preserve">lectura estándar del algoritmo </w:t>
+        <w:t xml:space="preserve">Es la lectura estándar del algoritmo </w:t>
       </w:r>
       <w:r>
         <w:t xml:space="preserve">[3]</w:t>
       </w:r>
       <w:r>
-        <w:t xml:space="preserve">.</w:t>
+        <w:t xml:space="preserve">; acá se</w:t>
+      </w:r>
+      <w:r>
+        <w:t xml:space="preserve"> </w:t>
+      </w:r>
+      <w:r>
+        <w:t xml:space="preserve">comprueba para una matriz de</w:t>
+      </w:r>
+      <w:r>
+        <w:t xml:space="preserve"> </w:t>
+      </w:r>
+      <m:oMath>
+        <m:r>
+          <m:t>2</m:t>
+        </m:r>
+        <m:r>
+          <m:rPr>
+            <m:sty m:val="p"/>
+          </m:rPr>
+          <m:t>×</m:t>
+        </m:r>
+        <m:r>
+          <m:t>2</m:t>
+        </m:r>
+      </m:oMath>
+      <w:r>
+        <w:t xml:space="preserve"> </w:t>
+      </w:r>
+      <w:r>
+        <w:t xml:space="preserve">con álgebra lineal exacta, no con un circuito.</w:t>
       </w:r>
     </w:p>
     <w:p>

</xml_diff>